<commit_message>
Nachtrag Dokumentation: Änderung des Storypointwertes/Woche nach interner Rücksprache auf 7
</commit_message>
<xml_diff>
--- a/backend/src/app/services/calculation/ProjectCalculationService_Dokumentation.docx
+++ b/backend/src/app/services/calculation/ProjectCalculationService_Dokumentation.docx
@@ -1750,7 +1750,21 @@
                 <w:sz w:val="20"/>
                 <w:szCs w:val="20"/>
               </w:rPr>
-              <w:t>Umgerechnete Backlog-Größe (1 PW = 8 SP)</w:t>
+              <w:t xml:space="preserve">Umgerechnete Backlog-Größe (1 PW = </w:t>
+            </w:r>
+            <w:r>
+              <w:rPr>
+                <w:sz w:val="20"/>
+                <w:szCs w:val="20"/>
+              </w:rPr>
+              <w:t>7</w:t>
+            </w:r>
+            <w:r>
+              <w:rPr>
+                <w:sz w:val="20"/>
+                <w:szCs w:val="20"/>
+              </w:rPr>
+              <w:t xml:space="preserve"> SP)</w:t>
             </w:r>
           </w:p>
         </w:tc>
@@ -3628,14 +3642,8 @@
           <w:sz w:val="18"/>
           <w:szCs w:val="18"/>
         </w:rPr>
-        <w:t xml:space="preserve"> × 8)</w:t>
-      </w:r>
-    </w:p>
-    <w:p>
-      <w:pPr>
-        <w:spacing w:before="60" w:after="60"/>
-        <w:ind w:left="720"/>
-      </w:pPr>
+        <w:t xml:space="preserve"> × </w:t>
+      </w:r>
       <w:r>
         <w:rPr>
           <w:rFonts w:ascii="Courier New" w:eastAsia="Courier New" w:hAnsi="Courier New" w:cs="Courier New"/>
@@ -3643,6 +3651,30 @@
           <w:sz w:val="18"/>
           <w:szCs w:val="18"/>
         </w:rPr>
+        <w:t>7</w:t>
+      </w:r>
+      <w:r>
+        <w:rPr>
+          <w:rFonts w:ascii="Courier New" w:eastAsia="Courier New" w:hAnsi="Courier New" w:cs="Courier New"/>
+          <w:color w:val="1A1A2E"/>
+          <w:sz w:val="18"/>
+          <w:szCs w:val="18"/>
+        </w:rPr>
+        <w:t>)</w:t>
+      </w:r>
+    </w:p>
+    <w:p>
+      <w:pPr>
+        <w:spacing w:before="60" w:after="60"/>
+        <w:ind w:left="720"/>
+      </w:pPr>
+      <w:r>
+        <w:rPr>
+          <w:rFonts w:ascii="Courier New" w:eastAsia="Courier New" w:hAnsi="Courier New" w:cs="Courier New"/>
+          <w:color w:val="1A1A2E"/>
+          <w:sz w:val="18"/>
+          <w:szCs w:val="18"/>
+        </w:rPr>
         <w:t>sprintCount  =  ⌈ storyPoints / velocityPerSprint ⌉</w:t>
       </w:r>
     </w:p>
@@ -3651,7 +3683,19 @@
         <w:spacing w:before="80" w:after="100"/>
       </w:pPr>
       <w:r>
-        <w:t>Die Umrechnungskonstante 8 entspricht 8 Story Points pro Personenwoche, wobei 1 Story Point näherungsweise einem Arbeitstag entspricht.</w:t>
+        <w:t xml:space="preserve">Die Umrechnungskonstante </w:t>
+      </w:r>
+      <w:r>
+        <w:t>7</w:t>
+      </w:r>
+      <w:r>
+        <w:t xml:space="preserve"> entspricht </w:t>
+      </w:r>
+      <w:r>
+        <w:t>7</w:t>
+      </w:r>
+      <w:r>
+        <w:t xml:space="preserve"> Story Points pro Personenwoche, wobei 1 Story Point näherungsweise einem Arbeitstag entspricht.</w:t>
       </w:r>
       <w:r>
         <w:t>. Story Points sind hier eine direkte lineare Transformation des Aufwands – die Methode abstrahiert dabei bewusst von teamspezifischen Skalierungsunterschieden.</w:t>

</xml_diff>